<commit_message>
feat: restructure distant and ochno flows according to contract department requirements and link new docx templates
</commit_message>
<xml_diff>
--- a/docx_templates/gochs-dist.docx
+++ b/docx_templates/gochs-dist.docx
@@ -2922,8 +2922,6 @@
               </w:rPr>
               <w:t>}}</w:t>
             </w:r>
-            <w:bookmarkStart w:id="0" w:name="_GoBack"/>
-            <w:bookmarkEnd w:id="0"/>
           </w:p>
         </w:tc>
       </w:tr>
@@ -2940,8 +2938,7 @@
     </w:p>
     <w:p>
       <w:pPr>
-        <w:ind w:left="-993" w:firstLine="709"/>
-        <w:jc w:val="both"/>
+        <w:outlineLvl w:val="0"/>
         <w:rPr>
           <w:rFonts w:ascii="Times New Roman" w:eastAsia="Times New Roman" w:hAnsi="Times New Roman" w:cs="Times New Roman"/>
           <w:b/>
@@ -2950,74 +2947,322 @@
           <w:lang w:val="ru-RU"/>
         </w:rPr>
       </w:pPr>
+      <w:bookmarkStart w:id="0" w:name="_GoBack"/>
+      <w:bookmarkEnd w:id="0"/>
     </w:p>
-    <w:p>
-      <w:pPr>
-        <w:ind w:left="-993"/>
-        <w:rPr>
-          <w:rFonts w:ascii="Times New Roman" w:eastAsia="Times New Roman" w:hAnsi="Times New Roman" w:cs="Times New Roman"/>
-          <w:lang w:val="ru-RU"/>
-        </w:rPr>
-      </w:pPr>
-      <w:r>
-        <w:rPr>
-          <w:rFonts w:ascii="Times New Roman" w:eastAsia="Times New Roman" w:hAnsi="Times New Roman" w:cs="Times New Roman"/>
-          <w:lang w:val="ru-RU"/>
-        </w:rPr>
-        <w:t xml:space="preserve"> </w:t>
-      </w:r>
-      <w:r>
-        <w:rPr>
-          <w:rFonts w:ascii="Times New Roman" w:eastAsia="Times New Roman" w:hAnsi="Times New Roman" w:cs="Times New Roman"/>
-          <w:lang w:val="ru-RU"/>
-        </w:rPr>
-        <w:t xml:space="preserve">      </w:t>
-      </w:r>
-      <w:r>
-        <w:rPr>
-          <w:rFonts w:ascii="Times New Roman" w:eastAsia="Times New Roman" w:hAnsi="Times New Roman" w:cs="Times New Roman"/>
-          <w:sz w:val="23"/>
-          <w:szCs w:val="23"/>
-          <w:lang w:val="ru-RU"/>
-        </w:rPr>
-        <w:t>Должность руководителя организации</w:t>
-      </w:r>
-      <w:r>
-        <w:rPr>
-          <w:rFonts w:ascii="Times New Roman" w:eastAsia="Times New Roman" w:hAnsi="Times New Roman" w:cs="Times New Roman"/>
-          <w:lang w:val="ru-RU"/>
-        </w:rPr>
-        <w:t xml:space="preserve">               </w:t>
-      </w:r>
-      <w:r>
-        <w:rPr>
-          <w:rFonts w:ascii="Times New Roman" w:eastAsia="Times New Roman" w:hAnsi="Times New Roman" w:cs="Times New Roman"/>
-          <w:lang w:val="ru-RU"/>
-        </w:rPr>
-        <w:t xml:space="preserve">                            </w:t>
-      </w:r>
-      <w:r>
-        <w:rPr>
-          <w:rFonts w:ascii="Times New Roman" w:eastAsia="Times New Roman" w:hAnsi="Times New Roman" w:cs="Times New Roman"/>
-          <w:lang w:val="ru-RU"/>
-        </w:rPr>
-        <w:tab/>
-      </w:r>
-      <w:r>
-        <w:rPr>
-          <w:rFonts w:ascii="Times New Roman" w:eastAsia="Times New Roman" w:hAnsi="Times New Roman" w:cs="Times New Roman"/>
-          <w:lang w:val="ru-RU"/>
-        </w:rPr>
-        <w:tab/>
-      </w:r>
-      <w:r>
-        <w:rPr>
-          <w:rFonts w:ascii="Times New Roman" w:eastAsia="Times New Roman" w:hAnsi="Times New Roman" w:cs="Times New Roman"/>
-          <w:lang w:val="ru-RU"/>
-        </w:rPr>
-        <w:t>______________________________                             _________________________</w:t>
-      </w:r>
-    </w:p>
+    <w:tbl>
+      <w:tblPr>
+        <w:tblStyle w:val="af0"/>
+        <w:tblW w:w="15877" w:type="dxa"/>
+        <w:tblInd w:w="-998" w:type="dxa"/>
+        <w:tblBorders>
+          <w:top w:val="none" w:sz="0" w:space="0" w:color="auto"/>
+          <w:left w:val="none" w:sz="0" w:space="0" w:color="auto"/>
+          <w:bottom w:val="none" w:sz="0" w:space="0" w:color="auto"/>
+          <w:right w:val="none" w:sz="0" w:space="0" w:color="auto"/>
+          <w:insideH w:val="none" w:sz="0" w:space="0" w:color="auto"/>
+          <w:insideV w:val="none" w:sz="0" w:space="0" w:color="auto"/>
+        </w:tblBorders>
+        <w:tblLook w:val="04A0" w:firstRow="1" w:lastRow="0" w:firstColumn="1" w:lastColumn="0" w:noHBand="0" w:noVBand="1"/>
+      </w:tblPr>
+      <w:tblGrid>
+        <w:gridCol w:w="7418"/>
+        <w:gridCol w:w="557"/>
+        <w:gridCol w:w="1536"/>
+        <w:gridCol w:w="2969"/>
+        <w:gridCol w:w="3397"/>
+      </w:tblGrid>
+      <w:tr>
+        <w:trPr>
+          <w:trHeight w:val="369"/>
+        </w:trPr>
+        <w:tc>
+          <w:tcPr>
+            <w:tcW w:w="7514" w:type="dxa"/>
+          </w:tcPr>
+          <w:p>
+            <w:pPr>
+              <w:outlineLvl w:val="0"/>
+              <w:rPr>
+                <w:rFonts w:ascii="Times New Roman" w:eastAsia="Times New Roman" w:hAnsi="Times New Roman" w:cs="Times New Roman"/>
+                <w:sz w:val="24"/>
+                <w:szCs w:val="24"/>
+                <w:lang w:val="ru-RU"/>
+              </w:rPr>
+            </w:pPr>
+            <w:r>
+              <w:rPr>
+                <w:rFonts w:ascii="Times New Roman" w:eastAsia="Times New Roman" w:hAnsi="Times New Roman" w:cs="Times New Roman"/>
+                <w:sz w:val="24"/>
+                <w:szCs w:val="24"/>
+                <w:lang w:val="ru-RU"/>
+              </w:rPr>
+              <w:t xml:space="preserve">Должность руководителя организации  </w:t>
+            </w:r>
+            <w:r>
+              <w:rPr>
+                <w:rFonts w:ascii="Times New Roman" w:eastAsia="Times New Roman" w:hAnsi="Times New Roman" w:cs="Times New Roman"/>
+                <w:sz w:val="24"/>
+                <w:szCs w:val="24"/>
+                <w:lang w:val="ru-RU"/>
+              </w:rPr>
+              <w:t>{{</w:t>
+            </w:r>
+            <w:r>
+              <w:rPr>
+                <w:rFonts w:ascii="Times New Roman" w:eastAsia="Times New Roman" w:hAnsi="Times New Roman" w:cs="Times New Roman"/>
+                <w:sz w:val="24"/>
+                <w:szCs w:val="24"/>
+              </w:rPr>
+              <w:t>boss</w:t>
+            </w:r>
+            <w:r>
+              <w:rPr>
+                <w:rFonts w:ascii="Times New Roman" w:eastAsia="Times New Roman" w:hAnsi="Times New Roman" w:cs="Times New Roman"/>
+                <w:sz w:val="24"/>
+                <w:szCs w:val="24"/>
+                <w:lang w:val="ru-RU"/>
+              </w:rPr>
+              <w:t>_</w:t>
+            </w:r>
+            <w:r>
+              <w:rPr>
+                <w:rFonts w:ascii="Times New Roman" w:eastAsia="Times New Roman" w:hAnsi="Times New Roman" w:cs="Times New Roman"/>
+                <w:sz w:val="24"/>
+                <w:szCs w:val="24"/>
+              </w:rPr>
+              <w:t>position</w:t>
+            </w:r>
+            <w:r>
+              <w:rPr>
+                <w:rFonts w:ascii="Times New Roman" w:eastAsia="Times New Roman" w:hAnsi="Times New Roman" w:cs="Times New Roman"/>
+                <w:sz w:val="24"/>
+                <w:szCs w:val="24"/>
+                <w:lang w:val="ru-RU"/>
+              </w:rPr>
+              <w:t>}}</w:t>
+            </w:r>
+          </w:p>
+        </w:tc>
+        <w:tc>
+          <w:tcPr>
+            <w:tcW w:w="425" w:type="dxa"/>
+          </w:tcPr>
+          <w:p>
+            <w:pPr>
+              <w:jc w:val="center"/>
+              <w:outlineLvl w:val="0"/>
+              <w:rPr>
+                <w:rFonts w:ascii="Times New Roman" w:eastAsia="Times New Roman" w:hAnsi="Times New Roman" w:cs="Times New Roman"/>
+                <w:sz w:val="24"/>
+                <w:szCs w:val="24"/>
+                <w:lang w:val="ru-RU"/>
+              </w:rPr>
+            </w:pPr>
+          </w:p>
+        </w:tc>
+        <w:tc>
+          <w:tcPr>
+            <w:tcW w:w="1559" w:type="dxa"/>
+          </w:tcPr>
+          <w:p>
+            <w:pPr>
+              <w:jc w:val="center"/>
+              <w:outlineLvl w:val="0"/>
+              <w:rPr>
+                <w:rFonts w:ascii="Times New Roman" w:eastAsia="Times New Roman" w:hAnsi="Times New Roman" w:cs="Times New Roman"/>
+                <w:sz w:val="24"/>
+                <w:szCs w:val="24"/>
+                <w:lang w:val="ru-RU"/>
+              </w:rPr>
+            </w:pPr>
+          </w:p>
+        </w:tc>
+        <w:tc>
+          <w:tcPr>
+            <w:tcW w:w="2977" w:type="dxa"/>
+          </w:tcPr>
+          <w:p>
+            <w:pPr>
+              <w:jc w:val="center"/>
+              <w:outlineLvl w:val="0"/>
+              <w:rPr>
+                <w:rFonts w:ascii="Times New Roman" w:eastAsia="Times New Roman" w:hAnsi="Times New Roman" w:cs="Times New Roman"/>
+                <w:sz w:val="24"/>
+                <w:szCs w:val="24"/>
+                <w:lang w:val="ru-RU"/>
+              </w:rPr>
+            </w:pPr>
+            <w:r>
+              <w:rPr>
+                <w:rFonts w:ascii="Times New Roman" w:eastAsia="Times New Roman" w:hAnsi="Times New Roman" w:cs="Times New Roman"/>
+                <w:sz w:val="24"/>
+                <w:szCs w:val="24"/>
+                <w:lang w:val="ru-RU"/>
+              </w:rPr>
+              <w:t>___________________</w:t>
+            </w:r>
+          </w:p>
+        </w:tc>
+        <w:tc>
+          <w:tcPr>
+            <w:tcW w:w="3402" w:type="dxa"/>
+          </w:tcPr>
+          <w:p>
+            <w:pPr>
+              <w:outlineLvl w:val="0"/>
+              <w:rPr>
+                <w:rFonts w:ascii="Times New Roman" w:eastAsia="Times New Roman" w:hAnsi="Times New Roman" w:cs="Times New Roman"/>
+                <w:sz w:val="24"/>
+                <w:szCs w:val="24"/>
+              </w:rPr>
+            </w:pPr>
+            <w:r>
+              <w:rPr>
+                <w:rFonts w:ascii="Times New Roman" w:eastAsia="Times New Roman" w:hAnsi="Times New Roman" w:cs="Times New Roman"/>
+                <w:sz w:val="24"/>
+                <w:szCs w:val="24"/>
+              </w:rPr>
+              <w:t>________________________</w:t>
+            </w:r>
+          </w:p>
+        </w:tc>
+      </w:tr>
+      <w:tr>
+        <w:trPr>
+          <w:trHeight w:val="532"/>
+        </w:trPr>
+        <w:tc>
+          <w:tcPr>
+            <w:tcW w:w="7514" w:type="dxa"/>
+          </w:tcPr>
+          <w:p>
+            <w:pPr>
+              <w:outlineLvl w:val="0"/>
+              <w:rPr>
+                <w:rFonts w:ascii="Times New Roman" w:eastAsia="Times New Roman" w:hAnsi="Times New Roman" w:cs="Times New Roman"/>
+                <w:sz w:val="24"/>
+                <w:szCs w:val="24"/>
+                <w:lang w:val="ru-RU"/>
+              </w:rPr>
+            </w:pPr>
+          </w:p>
+        </w:tc>
+        <w:tc>
+          <w:tcPr>
+            <w:tcW w:w="425" w:type="dxa"/>
+          </w:tcPr>
+          <w:p>
+            <w:pPr>
+              <w:jc w:val="center"/>
+              <w:outlineLvl w:val="0"/>
+              <w:rPr>
+                <w:rFonts w:ascii="Times New Roman" w:eastAsia="Times New Roman" w:hAnsi="Times New Roman" w:cs="Times New Roman"/>
+                <w:sz w:val="24"/>
+                <w:szCs w:val="24"/>
+                <w:lang w:val="ru-RU"/>
+              </w:rPr>
+            </w:pPr>
+            <w:r>
+              <w:rPr>
+                <w:rFonts w:ascii="Times New Roman" w:eastAsia="Times New Roman" w:hAnsi="Times New Roman" w:cs="Times New Roman"/>
+                <w:sz w:val="24"/>
+                <w:szCs w:val="24"/>
+                <w:lang w:val="ru-RU"/>
+              </w:rPr>
+              <w:t>м.п</w:t>
+            </w:r>
+          </w:p>
+        </w:tc>
+        <w:tc>
+          <w:tcPr>
+            <w:tcW w:w="1559" w:type="dxa"/>
+          </w:tcPr>
+          <w:p>
+            <w:pPr>
+              <w:jc w:val="center"/>
+              <w:outlineLvl w:val="0"/>
+              <w:rPr>
+                <w:rFonts w:ascii="Times New Roman" w:eastAsia="Times New Roman" w:hAnsi="Times New Roman" w:cs="Times New Roman"/>
+                <w:sz w:val="24"/>
+                <w:szCs w:val="24"/>
+                <w:lang w:val="ru-RU"/>
+              </w:rPr>
+            </w:pPr>
+          </w:p>
+        </w:tc>
+        <w:tc>
+          <w:tcPr>
+            <w:tcW w:w="2977" w:type="dxa"/>
+          </w:tcPr>
+          <w:p>
+            <w:pPr>
+              <w:jc w:val="center"/>
+              <w:outlineLvl w:val="0"/>
+              <w:rPr>
+                <w:rFonts w:ascii="Times New Roman" w:eastAsia="Times New Roman" w:hAnsi="Times New Roman" w:cs="Times New Roman"/>
+                <w:sz w:val="20"/>
+                <w:szCs w:val="20"/>
+                <w:lang w:val="ru-RU"/>
+              </w:rPr>
+            </w:pPr>
+            <w:r>
+              <w:rPr>
+                <w:rFonts w:ascii="Times New Roman" w:eastAsia="Times New Roman" w:hAnsi="Times New Roman" w:cs="Times New Roman"/>
+                <w:sz w:val="20"/>
+                <w:szCs w:val="20"/>
+                <w:lang w:val="ru-RU"/>
+              </w:rPr>
+              <w:t>(п</w:t>
+            </w:r>
+            <w:r>
+              <w:rPr>
+                <w:rFonts w:ascii="Times New Roman" w:eastAsia="Times New Roman" w:hAnsi="Times New Roman" w:cs="Times New Roman"/>
+                <w:sz w:val="20"/>
+                <w:szCs w:val="20"/>
+                <w:lang w:val="ru-RU"/>
+              </w:rPr>
+              <w:t>одпись</w:t>
+            </w:r>
+            <w:r>
+              <w:rPr>
+                <w:rFonts w:ascii="Times New Roman" w:eastAsia="Times New Roman" w:hAnsi="Times New Roman" w:cs="Times New Roman"/>
+                <w:sz w:val="20"/>
+                <w:szCs w:val="20"/>
+                <w:lang w:val="ru-RU"/>
+              </w:rPr>
+              <w:t>)</w:t>
+            </w:r>
+          </w:p>
+        </w:tc>
+        <w:tc>
+          <w:tcPr>
+            <w:tcW w:w="3402" w:type="dxa"/>
+          </w:tcPr>
+          <w:p>
+            <w:pPr>
+              <w:jc w:val="center"/>
+              <w:outlineLvl w:val="0"/>
+              <w:rPr>
+                <w:rFonts w:ascii="Times New Roman" w:eastAsia="Times New Roman" w:hAnsi="Times New Roman" w:cs="Times New Roman"/>
+                <w:sz w:val="20"/>
+                <w:szCs w:val="20"/>
+                <w:lang w:val="ru-RU"/>
+              </w:rPr>
+            </w:pPr>
+            <w:r>
+              <w:rPr>
+                <w:rFonts w:ascii="Times New Roman" w:eastAsia="Times New Roman" w:hAnsi="Times New Roman" w:cs="Times New Roman"/>
+                <w:sz w:val="20"/>
+                <w:szCs w:val="20"/>
+                <w:lang w:val="ru-RU"/>
+              </w:rPr>
+              <w:t>(расшифровка подписи)</w:t>
+            </w:r>
+          </w:p>
+        </w:tc>
+      </w:tr>
+    </w:tbl>
     <w:p>
       <w:pPr>
         <w:outlineLvl w:val="0"/>
@@ -3028,130 +3273,6 @@
           <w:lang w:val="ru-RU"/>
         </w:rPr>
       </w:pPr>
-      <w:r>
-        <w:rPr>
-          <w:rFonts w:ascii="Times New Roman" w:hAnsi="Times New Roman" w:cs="Times New Roman"/>
-          <w:b/>
-          <w:spacing w:val="-1"/>
-          <w:lang w:val="ru-RU"/>
-        </w:rPr>
-        <w:t xml:space="preserve">                                                                </w:t>
-      </w:r>
-      <w:r>
-        <w:rPr>
-          <w:rFonts w:ascii="Times New Roman" w:hAnsi="Times New Roman" w:cs="Times New Roman"/>
-          <w:b/>
-          <w:spacing w:val="-1"/>
-          <w:lang w:val="ru-RU"/>
-        </w:rPr>
-        <w:tab/>
-      </w:r>
-      <w:r>
-        <w:rPr>
-          <w:rFonts w:ascii="Times New Roman" w:hAnsi="Times New Roman" w:cs="Times New Roman"/>
-          <w:b/>
-          <w:spacing w:val="-1"/>
-          <w:lang w:val="ru-RU"/>
-        </w:rPr>
-        <w:tab/>
-      </w:r>
-      <w:r>
-        <w:rPr>
-          <w:rFonts w:ascii="Times New Roman" w:hAnsi="Times New Roman" w:cs="Times New Roman"/>
-          <w:b/>
-          <w:spacing w:val="-1"/>
-          <w:lang w:val="ru-RU"/>
-        </w:rPr>
-        <w:t>м.п</w:t>
-      </w:r>
-      <w:r>
-        <w:rPr>
-          <w:rFonts w:ascii="Times New Roman" w:hAnsi="Times New Roman" w:cs="Times New Roman"/>
-          <w:spacing w:val="-1"/>
-          <w:lang w:val="ru-RU"/>
-        </w:rPr>
-        <w:t xml:space="preserve">.                                      </w:t>
-      </w:r>
-      <w:r>
-        <w:rPr>
-          <w:rFonts w:ascii="Times New Roman" w:hAnsi="Times New Roman" w:cs="Times New Roman"/>
-          <w:spacing w:val="-1"/>
-          <w:lang w:val="ru-RU"/>
-        </w:rPr>
-        <w:t xml:space="preserve"> </w:t>
-      </w:r>
-      <w:r>
-        <w:rPr>
-          <w:rFonts w:ascii="Times New Roman" w:hAnsi="Times New Roman" w:cs="Times New Roman"/>
-          <w:spacing w:val="-1"/>
-          <w:lang w:val="ru-RU"/>
-        </w:rPr>
-        <w:tab/>
-      </w:r>
-      <w:r>
-        <w:rPr>
-          <w:rFonts w:ascii="Times New Roman" w:hAnsi="Times New Roman" w:cs="Times New Roman"/>
-          <w:spacing w:val="-1"/>
-          <w:lang w:val="ru-RU"/>
-        </w:rPr>
-        <w:t xml:space="preserve"> </w:t>
-      </w:r>
-      <w:r>
-        <w:rPr>
-          <w:rFonts w:ascii="Times New Roman" w:hAnsi="Times New Roman" w:cs="Times New Roman"/>
-          <w:spacing w:val="-1"/>
-          <w:lang w:val="ru-RU"/>
-        </w:rPr>
-        <w:t>(подпись)</w:t>
-      </w:r>
-      <w:r>
-        <w:rPr>
-          <w:rFonts w:ascii="Times New Roman" w:hAnsi="Times New Roman" w:cs="Times New Roman"/>
-          <w:spacing w:val="-1"/>
-          <w:lang w:val="ru-RU"/>
-        </w:rPr>
-        <w:tab/>
-      </w:r>
-      <w:r>
-        <w:rPr>
-          <w:rFonts w:ascii="Times New Roman" w:hAnsi="Times New Roman" w:cs="Times New Roman"/>
-          <w:spacing w:val="-1"/>
-          <w:lang w:val="ru-RU"/>
-        </w:rPr>
-        <w:tab/>
-      </w:r>
-      <w:r>
-        <w:rPr>
-          <w:rFonts w:ascii="Times New Roman" w:hAnsi="Times New Roman" w:cs="Times New Roman"/>
-          <w:spacing w:val="-1"/>
-          <w:lang w:val="ru-RU"/>
-        </w:rPr>
-        <w:tab/>
-      </w:r>
-      <w:r>
-        <w:rPr>
-          <w:rFonts w:ascii="Times New Roman" w:hAnsi="Times New Roman" w:cs="Times New Roman"/>
-          <w:spacing w:val="-1"/>
-          <w:lang w:val="ru-RU"/>
-        </w:rPr>
-        <w:tab/>
-      </w:r>
-      <w:r>
-        <w:rPr>
-          <w:rFonts w:ascii="Times New Roman" w:hAnsi="Times New Roman" w:cs="Times New Roman"/>
-          <w:spacing w:val="-1"/>
-          <w:lang w:val="ru-RU"/>
-        </w:rPr>
-        <w:t xml:space="preserve">                 </w:t>
-      </w:r>
-      <w:r>
-        <w:rPr>
-          <w:rFonts w:ascii="Times New Roman" w:hAnsi="Times New Roman" w:cs="Times New Roman"/>
-          <w:spacing w:val="-1"/>
-          <w:lang w:val="ru-RU"/>
-        </w:rPr>
-        <w:t>(расшифровка подпись)</w:t>
-      </w:r>
     </w:p>
     <w:sectPr>
       <w:type w:val="continuous"/>
@@ -3946,6 +4067,22 @@
       <w:u w:val="single"/>
     </w:rPr>
   </w:style>
+  <w:style w:type="table" w:styleId="af0">
+    <w:name w:val="Table Grid"/>
+    <w:basedOn w:val="a1"/>
+    <w:uiPriority w:val="59"/>
+    <w:rsid w:val="0072388C"/>
+    <w:tblPr>
+      <w:tblBorders>
+        <w:top w:val="single" w:sz="4" w:space="0" w:color="auto"/>
+        <w:left w:val="single" w:sz="4" w:space="0" w:color="auto"/>
+        <w:bottom w:val="single" w:sz="4" w:space="0" w:color="auto"/>
+        <w:right w:val="single" w:sz="4" w:space="0" w:color="auto"/>
+        <w:insideH w:val="single" w:sz="4" w:space="0" w:color="auto"/>
+        <w:insideV w:val="single" w:sz="4" w:space="0" w:color="auto"/>
+      </w:tblBorders>
+    </w:tblPr>
+  </w:style>
 </w:styles>
 </file>
 
@@ -4237,7 +4374,7 @@
 </file>
 
 <file path=customXml/itemProps1.xml><?xml version="1.0" encoding="utf-8"?>
-<ds:datastoreItem xmlns:ds="http://schemas.openxmlformats.org/officeDocument/2006/customXml" ds:itemID="{077F5351-8896-484E-A4AB-F492D28D6FEC}">
+<ds:datastoreItem xmlns:ds="http://schemas.openxmlformats.org/officeDocument/2006/customXml" ds:itemID="{D0B23197-4E7F-4C8E-8C20-8CC68CA9B330}">
   <ds:schemaRefs>
     <ds:schemaRef ds:uri="http://schemas.openxmlformats.org/officeDocument/2006/bibliography"/>
   </ds:schemaRefs>

</xml_diff>